<commit_message>
Fix old "约束冲突" terminology in docx files
</commit_message>
<xml_diff>
--- a/assets/发射计划-1天闪电战.docx
+++ b/assets/发射计划-1天闪电战.docx
@@ -580,7 +580,7 @@
     </w:p>
     <w:p>
       <w:r>
-        <w:t>"约束冲突检测器"是未被占据的心智位置。"AI benchmark"有 47 个竞品，"代码助手"有 200+ 个。我们不在红海竞争——我们开创了自己的品类。</w:t>
+        <w:t>"多源一致性引擎（MSCE）"是未被占据的心智位置。"AI benchmark"有 47 个竞品，"代码助手"有 200+ 个。我们不在红海竞争——我们开创了自己的品类。</w:t>
       </w:r>
     </w:p>
     <w:p>
@@ -1088,7 +1088,7 @@
         <w:pStyle w:val="ListBullet"/>
       </w:pPr>
       <w:r>
-        <w:t>更新所有文案中的术语（约束 → 校验条件 等）</w:t>
+        <w:t>更新所有文案中的术语（旧术语 → 校验条件 / 条件 等）</w:t>
       </w:r>
     </w:p>
     <w:p>

</xml_diff>